<commit_message>
SAVEPOINT: freeze cover text-heuristics; pivot to Vision AI PoC for Title/Subtitle/Author detection
</commit_message>
<xml_diff>
--- a/output/test.docx
+++ b/output/test.docx
@@ -8,39 +8,32 @@
       </w:pPr>
       <w:bookmarkStart w:id="0" w:name="L_ETE_A_L_OMBRE"/>
       <w:r>
-        <w:rPr>
-          <w:rStyle w:val="7Text"/>
-        </w:rPr>
+        <w:rPr/>
         <w:br/>
       </w:r>
       <w:r>
-        <w:rPr>
-          <w:rStyle w:val="7Text"/>
-        </w:rPr>
+        <w:rPr/>
         <w:br/>
       </w:r>
       <w:r>
-        <w:rPr>
-          <w:rStyle w:val="7Text"/>
-        </w:rPr>
+        <w:rPr/>
         <w:br/>
         <w:t>L’ÉTÉ</w:t>
       </w:r>
       <w:r>
-        <w:rPr>
-          <w:rStyle w:val="7Text"/>
-        </w:rPr>
+        <w:rPr/>
         <w:br/>
         <w:t xml:space="preserve"> </w:t>
       </w:r>
       <w:r>
+        <w:rPr/>
         <w:t>A L’OMBRE</w:t>
       </w:r>
       <w:bookmarkEnd w:id="0"/>
     </w:p>
     <w:p>
       <w:pPr>
-        <w:pStyle w:val="CoverAuthor"/>
+        <w:pStyle w:val="CoverTitle"/>
       </w:pPr>
       <w:r>
         <w:rPr>
@@ -85,14 +78,16 @@
         <w:br/>
       </w:r>
       <w:r>
+        <w:rPr/>
         <w:t>JEAN AICARD</w:t>
       </w:r>
     </w:p>
     <w:p>
       <w:pPr>
-        <w:pStyle w:val="CoverAuthor"/>
-      </w:pPr>
-      <w:r>
+        <w:pStyle w:val="CoverTitle"/>
+      </w:pPr>
+      <w:r>
+        <w:rPr/>
         <w:t>1895</w:t>
       </w:r>
     </w:p>

</xml_diff>